<commit_message>
refactor(cetak): improve user sorting of Kpps users and update order in approval status display for better clarity
</commit_message>
<xml_diff>
--- a/template/surat Kesediaan Tim Penelaah Proposal TEMPLATE.docx
+++ b/template/surat Kesediaan Tim Penelaah Proposal TEMPLATE.docx
@@ -508,7 +508,7 @@
           </mc:Choice>
           <mc:Fallback>
             <w:pict>
-              <v:shape w14:anchorId="354EB732" id="Graphic 2" o:spid="_x0000_s1026" style="position:absolute;margin-left:67.9pt;margin-top:12.35pt;width:470.55pt;height:3pt;z-index:-15728640;visibility:visible;mso-wrap-style:square;mso-wrap-distance-left:0;mso-wrap-distance-top:0;mso-wrap-distance-right:0;mso-wrap-distance-bottom:0;mso-position-horizontal:absolute;mso-position-horizontal-relative:page;mso-position-vertical:absolute;mso-position-vertical-relative:text;v-text-anchor:top" coordsize="5975985,38100" o:gfxdata="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" path="m5975985,25400l,25400,,38100r5975985,l5975985,25400xem5975985,l,,,12700r5975985,l5975985,xe" fillcolor="black" stroked="f">
+              <v:shape w14:anchorId="3B47894D" id="Graphic 2" o:spid="_x0000_s1026" style="position:absolute;margin-left:67.9pt;margin-top:12.35pt;width:470.55pt;height:3pt;z-index:-15728640;visibility:visible;mso-wrap-style:square;mso-wrap-distance-left:0;mso-wrap-distance-top:0;mso-wrap-distance-right:0;mso-wrap-distance-bottom:0;mso-position-horizontal:absolute;mso-position-horizontal-relative:page;mso-position-vertical:absolute;mso-position-vertical-relative:text;v-text-anchor:top" coordsize="5975985,38100" o:gfxdata="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" path="m5975985,25400l,25400,,38100r5975985,l5975985,25400xem5975985,l,,,12700r5975985,l5975985,xe" fillcolor="black" stroked="f">
                 <v:path arrowok="t"/>
                 <w10:wrap type="topAndBottom" anchorx="page"/>
               </v:shape>
@@ -1936,6 +1936,18 @@
       <w:pPr>
         <w:pStyle w:val="BodyText"/>
         <w:spacing w:before="84"/>
+      </w:pPr>
+    </w:p>
+    <w:p>
+      <w:pPr>
+        <w:pStyle w:val="BodyText"/>
+        <w:ind w:left="129"/>
+      </w:pPr>
+    </w:p>
+    <w:p>
+      <w:pPr>
+        <w:pStyle w:val="BodyText"/>
+        <w:ind w:left="129"/>
       </w:pPr>
     </w:p>
     <w:p>

</xml_diff>

<commit_message>
refactor(template): update surat penelaah templates to improve formatting and placeholder consistency
</commit_message>
<xml_diff>
--- a/template/surat Kesediaan Tim Penelaah Proposal TEMPLATE.docx
+++ b/template/surat Kesediaan Tim Penelaah Proposal TEMPLATE.docx
@@ -1,6 +1,6 @@
 
 <file path=word/document.xml><?xml version="1.0" encoding="utf-8"?>
-<w:document xmlns:wpc="http://schemas.microsoft.com/office/word/2010/wordprocessingCanvas" xmlns:cx="http://schemas.microsoft.com/office/drawing/2014/chartex" xmlns:cx1="http://schemas.microsoft.com/office/drawing/2015/9/8/chartex" xmlns:cx2="http://schemas.microsoft.com/office/drawing/2015/10/21/chartex" xmlns:cx3="http://schemas.microsoft.com/office/drawing/2016/5/9/chartex" xmlns:cx4="http://schemas.microsoft.com/office/drawing/2016/5/10/chartex" xmlns:cx5="http://schemas.microsoft.com/office/drawing/2016/5/11/chartex" xmlns:cx6="http://schemas.microsoft.com/office/drawing/2016/5/12/chartex" xmlns:cx7="http://schemas.microsoft.com/office/drawing/2016/5/13/chartex" xmlns:cx8="http://schemas.microsoft.com/office/drawing/2016/5/14/chartex" xmlns:mc="http://schemas.openxmlformats.org/markup-compatibility/2006" xmlns:aink="http://schemas.microsoft.com/office/drawing/2016/ink" xmlns:am3d="http://schemas.microsoft.com/office/drawing/2017/model3d" xmlns:o="urn:schemas-microsoft-com:office:office" xmlns:oel="http://schemas.microsoft.com/office/2019/extlst" xmlns:r="http://schemas.openxmlformats.org/officeDocument/2006/relationships" xmlns:m="http://schemas.openxmlformats.org/officeDocument/2006/math" xmlns:v="urn:schemas-microsoft-com:vml" xmlns:wp14="http://schemas.microsoft.com/office/word/2010/wordprocessingDrawing" xmlns:wp="http://schemas.openxmlformats.org/drawingml/2006/wordprocessingDrawing" xmlns:w10="urn:schemas-microsoft-com:office:word" xmlns:w="http://schemas.openxmlformats.org/wordprocessingml/2006/main" xmlns:w14="http://schemas.microsoft.com/office/word/2010/wordml" xmlns:w15="http://schemas.microsoft.com/office/word/2012/wordml" xmlns:w16cex="http://schemas.microsoft.com/office/word/2018/wordml/cex" xmlns:w16cid="http://schemas.microsoft.com/office/word/2016/wordml/cid" xmlns:w16="http://schemas.microsoft.com/office/word/2018/wordml" xmlns:w16du="http://schemas.microsoft.com/office/word/2023/wordml/word16du" xmlns:w16sdtdh="http://schemas.microsoft.com/office/word/2020/wordml/sdtdatahash" xmlns:w16sdtfl="http://schemas.microsoft.com/office/word/2024/wordml/sdtformatlock" xmlns:w16se="http://schemas.microsoft.com/office/word/2015/wordml/symex" xmlns:wpg="http://schemas.microsoft.com/office/word/2010/wordprocessingGroup" xmlns:wpi="http://schemas.microsoft.com/office/word/2010/wordprocessingInk" xmlns:wne="http://schemas.microsoft.com/office/word/2006/wordml" xmlns:wps="http://schemas.microsoft.com/office/word/2010/wordprocessingShape" mc:Ignorable="w14 w15 w16se w16cid w16 w16cex w16sdtdh w16sdtfl w16du wp14">
+<w:document xmlns:wpc="http://schemas.microsoft.com/office/word/2010/wordprocessingCanvas" xmlns:cx="http://schemas.microsoft.com/office/drawing/2014/chartex" xmlns:mc="http://schemas.openxmlformats.org/markup-compatibility/2006" xmlns:o="urn:schemas-microsoft-com:office:office" xmlns:r="http://schemas.openxmlformats.org/officeDocument/2006/relationships" xmlns:m="http://schemas.openxmlformats.org/officeDocument/2006/math" xmlns:v="urn:schemas-microsoft-com:vml" xmlns:wp14="http://schemas.microsoft.com/office/word/2010/wordprocessingDrawing" xmlns:wp="http://schemas.openxmlformats.org/drawingml/2006/wordprocessingDrawing" xmlns:w10="urn:schemas-microsoft-com:office:word" xmlns:w="http://schemas.openxmlformats.org/wordprocessingml/2006/main" xmlns:w14="http://schemas.microsoft.com/office/word/2010/wordml" xmlns:w15="http://schemas.microsoft.com/office/word/2012/wordml" xmlns:w16se="http://schemas.microsoft.com/office/word/2015/wordml/symex" xmlns:wpg="http://schemas.microsoft.com/office/word/2010/wordprocessingGroup" xmlns:wpi="http://schemas.microsoft.com/office/word/2010/wordprocessingInk" xmlns:wne="http://schemas.microsoft.com/office/word/2006/wordml" xmlns:wps="http://schemas.microsoft.com/office/word/2010/wordprocessingShape" mc:Ignorable="w14 w15 w16se wp14">
   <w:body>
     <w:p>
       <w:pPr>
@@ -9,6 +9,7 @@
       <w:r>
         <w:rPr>
           <w:noProof/>
+          <w:lang w:val="en-US"/>
         </w:rPr>
         <w:drawing>
           <wp:anchor distT="0" distB="0" distL="0" distR="0" simplePos="0" relativeHeight="15729152" behindDoc="0" locked="0" layoutInCell="1" allowOverlap="1" wp14:anchorId="66280115" wp14:editId="27BE5E91">
@@ -415,6 +416,7 @@
           <w:rFonts w:ascii="Trebuchet MS"/>
           <w:noProof/>
           <w:sz w:val="16"/>
+          <w:lang w:val="en-US"/>
         </w:rPr>
         <mc:AlternateContent>
           <mc:Choice Requires="wps">
@@ -508,7 +510,7 @@
           </mc:Choice>
           <mc:Fallback>
             <w:pict>
-              <v:shape w14:anchorId="76852BA2" id="Graphic 2" o:spid="_x0000_s1026" style="position:absolute;margin-left:67.9pt;margin-top:12.35pt;width:470.55pt;height:3pt;z-index:-15728640;visibility:visible;mso-wrap-style:square;mso-wrap-distance-left:0;mso-wrap-distance-top:0;mso-wrap-distance-right:0;mso-wrap-distance-bottom:0;mso-position-horizontal:absolute;mso-position-horizontal-relative:page;mso-position-vertical:absolute;mso-position-vertical-relative:text;v-text-anchor:top" coordsize="5975985,38100" o:gfxdata="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" path="m5975985,25400l,25400,,38100r5975985,l5975985,25400xem5975985,l,,,12700r5975985,l5975985,xe" fillcolor="black" stroked="f">
+              <v:shape w14:anchorId="75B902BB" id="Graphic 2" o:spid="_x0000_s1026" style="position:absolute;margin-left:67.9pt;margin-top:12.35pt;width:470.55pt;height:3pt;z-index:-15728640;visibility:visible;mso-wrap-style:square;mso-wrap-distance-left:0;mso-wrap-distance-top:0;mso-wrap-distance-right:0;mso-wrap-distance-bottom:0;mso-position-horizontal:absolute;mso-position-horizontal-relative:page;mso-position-vertical:absolute;mso-position-vertical-relative:text;v-text-anchor:top" coordsize="5975985,38100" o:gfxdata="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" path="m5975985,25400l,25400,,38100r5975985,l5975985,25400xem5975985,l,,,12700r5975985,l5975985,xe" fillcolor="black" stroked="f">
                 <v:path arrowok="t"/>
                 <w10:wrap type="topAndBottom" anchorx="page"/>
               </v:shape>
@@ -615,61 +617,162 @@
         <w:spacing w:before="154"/>
         <w:ind w:left="143"/>
       </w:pPr>
-      <w:r>
-        <w:rPr>
-          <w:spacing w:val="-2"/>
-        </w:rPr>
-        <w:t>Nomor</w:t>
-      </w:r>
-      <w:r>
-        <w:tab/>
-      </w:r>
-      <w:r>
-        <w:rPr>
-          <w:spacing w:val="-10"/>
-        </w:rPr>
-        <w:t>:</w:t>
-      </w:r>
-      <w:r>
-        <w:tab/>
-      </w:r>
-      <w:r>
-        <w:rPr>
-          <w:spacing w:val="-2"/>
-        </w:rPr>
-        <w:t>${no_surat_penelaah}</w:t>
-      </w:r>
-      <w:r>
-        <w:rPr>
-          <w:spacing w:val="-2"/>
-        </w:rPr>
-        <w:t xml:space="preserve"/>
-      </w:r>
-      <w:r>
-        <w:rPr>
-          <w:spacing w:val="-2"/>
-        </w:rPr>
-        <w:t/>
-      </w:r>
-      <w:r>
-        <w:tab/>
-      </w:r>
-      <w:r>
-        <w:t>${tgl_penelaah}</w:t>
-      </w:r>
-      <w:r>
-        <w:rPr>
-          <w:spacing w:val="-4"/>
-        </w:rPr>
-        <w:t/>
-      </w:r>
-      <w:r>
-        <w:rPr>
-          <w:spacing w:val="-4"/>
-        </w:rPr>
-        <w:t/>
-      </w:r>
-    </w:p>
+    </w:p>
+    <w:tbl>
+      <w:tblPr>
+        <w:tblStyle w:val="TableGrid"/>
+        <w:tblW w:w="0" w:type="auto"/>
+        <w:tblInd w:w="143" w:type="dxa"/>
+        <w:tblBorders>
+          <w:top w:val="none" w:sz="0" w:space="0" w:color="auto"/>
+          <w:left w:val="none" w:sz="0" w:space="0" w:color="auto"/>
+          <w:bottom w:val="none" w:sz="0" w:space="0" w:color="auto"/>
+          <w:right w:val="none" w:sz="0" w:space="0" w:color="auto"/>
+          <w:insideH w:val="none" w:sz="0" w:space="0" w:color="auto"/>
+          <w:insideV w:val="none" w:sz="0" w:space="0" w:color="auto"/>
+        </w:tblBorders>
+        <w:tblLook w:val="04A0" w:firstRow="1" w:lastRow="0" w:firstColumn="1" w:lastColumn="0" w:noHBand="0" w:noVBand="1"/>
+      </w:tblPr>
+      <w:tblGrid>
+        <w:gridCol w:w="6628"/>
+        <w:gridCol w:w="3088"/>
+      </w:tblGrid>
+      <w:tr>
+        <w:tc>
+          <w:tcPr>
+            <w:tcW w:w="6628" w:type="dxa"/>
+          </w:tcPr>
+          <w:p>
+            <w:pPr>
+              <w:pStyle w:val="BodyText"/>
+              <w:tabs>
+                <w:tab w:val="left" w:pos="1562"/>
+                <w:tab w:val="left" w:pos="1845"/>
+                <w:tab w:val="left" w:pos="8132"/>
+              </w:tabs>
+              <w:spacing w:before="154"/>
+              <w:rPr>
+                <w:lang w:val="en-US"/>
+              </w:rPr>
+            </w:pPr>
+            <w:r>
+              <w:rPr>
+                <w:spacing w:val="-2"/>
+              </w:rPr>
+              <w:t>Nomor</w:t>
+            </w:r>
+            <w:r>
+              <w:rPr>
+                <w:spacing w:val="-2"/>
+                <w:lang w:val="en-US"/>
+              </w:rPr>
+              <w:t xml:space="preserve">                 </w:t>
+            </w:r>
+            <w:r>
+              <w:rPr>
+                <w:spacing w:val="-10"/>
+              </w:rPr>
+              <w:t>:</w:t>
+            </w:r>
+            <w:r>
+              <w:rPr>
+                <w:spacing w:val="-10"/>
+                <w:lang w:val="en-US"/>
+              </w:rPr>
+              <w:t xml:space="preserve">     </w:t>
+            </w:r>
+            <w:r>
+              <w:rPr>
+                <w:lang w:val="en-US"/>
+              </w:rPr>
+              <w:t>${no_surat_penelaah}</w:t>
+            </w:r>
+            <w:r>
+              <w:rPr>
+                <w:spacing w:val="-4"/>
+                <w:lang w:val="en-US"/>
+              </w:rPr>
+              <w:t xml:space="preserve"/>
+            </w:r>
+            <w:proofErr w:type="spellStart"/>
+            <w:r>
+              <w:rPr>
+                <w:spacing w:val="-4"/>
+                <w:lang w:val="en-US"/>
+              </w:rPr>
+              <w:t/>
+            </w:r>
+            <w:proofErr w:type="spellEnd"/>
+            <w:r>
+              <w:rPr>
+                <w:spacing w:val="-4"/>
+                <w:lang w:val="en-US"/>
+              </w:rPr>
+              <w:t xml:space="preserve"/>
+            </w:r>
+            <w:r>
+              <w:rPr>
+                <w:spacing w:val="-4"/>
+              </w:rPr>
+              <w:t/>
+            </w:r>
+            <w:r>
+              <w:rPr>
+                <w:spacing w:val="-4"/>
+                <w:lang w:val="en-US"/>
+              </w:rPr>
+              <w:t/>
+            </w:r>
+          </w:p>
+        </w:tc>
+        <w:tc>
+          <w:tcPr>
+            <w:tcW w:w="3088" w:type="dxa"/>
+          </w:tcPr>
+          <w:p>
+            <w:pPr>
+              <w:pStyle w:val="BodyText"/>
+              <w:tabs>
+                <w:tab w:val="left" w:pos="1562"/>
+                <w:tab w:val="left" w:pos="1845"/>
+                <w:tab w:val="left" w:pos="8132"/>
+              </w:tabs>
+              <w:spacing w:before="154"/>
+              <w:rPr>
+                <w:lang w:val="en-US"/>
+              </w:rPr>
+            </w:pPr>
+            <w:r>
+              <w:rPr>
+                <w:lang w:val="en-US"/>
+              </w:rPr>
+              <w:t>${tgl_penelaah}</w:t>
+            </w:r>
+            <w:r>
+              <w:rPr>
+                <w:spacing w:val="-4"/>
+              </w:rPr>
+              <w:t/>
+            </w:r>
+            <w:bookmarkStart w:id="1" w:name="_GoBack"/>
+            <w:bookmarkEnd w:id="1"/>
+            <w:r>
+              <w:rPr>
+                <w:spacing w:val="-4"/>
+              </w:rPr>
+              <w:t/>
+            </w:r>
+            <w:r>
+              <w:rPr>
+                <w:spacing w:val="-4"/>
+                <w:lang w:val="en-US"/>
+              </w:rPr>
+              <w:t/>
+            </w:r>
+          </w:p>
+        </w:tc>
+      </w:tr>
+    </w:tbl>
     <w:p>
       <w:pPr>
         <w:pStyle w:val="BodyText"/>
@@ -1044,7 +1147,10 @@
         <w:jc w:val="both"/>
       </w:pPr>
       <w:r>
-        <w:t>Melalui surat dengan hormat kami sampaikan permohonan kiranya Bapak berkenan menjadi Tim Penelaah Proposal Penelitian Disertasi bagi mahasiswa Program Doktor Teknik Geofisika, yaitu:</w:t>
+        <w:t xml:space="preserve">Melalui surat dengan hormat kami sampaikan permohonan kiranya Bapak berkenan menjadi Tim Penelaah Proposal Penelitian Disertasi </w:t>
+      </w:r>
+      <w:r>
+        <w:t>bagi mahasiswa Program Doktor Teknik Geofisika, yaitu:</w:t>
       </w:r>
     </w:p>
     <w:p>
@@ -2086,6 +2192,7 @@
           <w:b w:val="0"/>
           <w:u w:val="single"/>
         </w:rPr>
+        <w:lastRenderedPageBreak/>
         <w:t>${nama_wda}</w:t>
       </w:r>
       <w:r>
@@ -2143,6 +2250,7 @@
         </w:tabs>
       </w:pPr>
       <w:r>
+        <w:lastRenderedPageBreak/>
         <w:t>Ketua</w:t>
       </w:r>
       <w:r>
@@ -2250,7 +2358,7 @@
 </file>
 
 <file path=word/numbering.xml><?xml version="1.0" encoding="utf-8"?>
-<w:numbering xmlns:wpc="http://schemas.microsoft.com/office/word/2010/wordprocessingCanvas" xmlns:cx="http://schemas.microsoft.com/office/drawing/2014/chartex" xmlns:cx1="http://schemas.microsoft.com/office/drawing/2015/9/8/chartex" xmlns:cx2="http://schemas.microsoft.com/office/drawing/2015/10/21/chartex" xmlns:cx3="http://schemas.microsoft.com/office/drawing/2016/5/9/chartex" xmlns:cx4="http://schemas.microsoft.com/office/drawing/2016/5/10/chartex" xmlns:cx5="http://schemas.microsoft.com/office/drawing/2016/5/11/chartex" xmlns:cx6="http://schemas.microsoft.com/office/drawing/2016/5/12/chartex" xmlns:cx7="http://schemas.microsoft.com/office/drawing/2016/5/13/chartex" xmlns:cx8="http://schemas.microsoft.com/office/drawing/2016/5/14/chartex" xmlns:mc="http://schemas.openxmlformats.org/markup-compatibility/2006" xmlns:aink="http://schemas.microsoft.com/office/drawing/2016/ink" xmlns:am3d="http://schemas.microsoft.com/office/drawing/2017/model3d" xmlns:o="urn:schemas-microsoft-com:office:office" xmlns:oel="http://schemas.microsoft.com/office/2019/extlst" xmlns:r="http://schemas.openxmlformats.org/officeDocument/2006/relationships" xmlns:m="http://schemas.openxmlformats.org/officeDocument/2006/math" xmlns:v="urn:schemas-microsoft-com:vml" xmlns:wp14="http://schemas.microsoft.com/office/word/2010/wordprocessingDrawing" xmlns:wp="http://schemas.openxmlformats.org/drawingml/2006/wordprocessingDrawing" xmlns:w10="urn:schemas-microsoft-com:office:word" xmlns:w="http://schemas.openxmlformats.org/wordprocessingml/2006/main" xmlns:w14="http://schemas.microsoft.com/office/word/2010/wordml" xmlns:w15="http://schemas.microsoft.com/office/word/2012/wordml" xmlns:w16cex="http://schemas.microsoft.com/office/word/2018/wordml/cex" xmlns:w16cid="http://schemas.microsoft.com/office/word/2016/wordml/cid" xmlns:w16="http://schemas.microsoft.com/office/word/2018/wordml" xmlns:w16du="http://schemas.microsoft.com/office/word/2023/wordml/word16du" xmlns:w16sdtdh="http://schemas.microsoft.com/office/word/2020/wordml/sdtdatahash" xmlns:w16sdtfl="http://schemas.microsoft.com/office/word/2024/wordml/sdtformatlock" xmlns:w16se="http://schemas.microsoft.com/office/word/2015/wordml/symex" xmlns:wpg="http://schemas.microsoft.com/office/word/2010/wordprocessingGroup" xmlns:wpi="http://schemas.microsoft.com/office/word/2010/wordprocessingInk" xmlns:wne="http://schemas.microsoft.com/office/word/2006/wordml" xmlns:wps="http://schemas.microsoft.com/office/word/2010/wordprocessingShape" mc:Ignorable="w14 w15 w16se w16cid w16 w16cex w16sdtdh w16sdtfl w16du wp14">
+<w:numbering xmlns:wpc="http://schemas.microsoft.com/office/word/2010/wordprocessingCanvas" xmlns:cx="http://schemas.microsoft.com/office/drawing/2014/chartex" xmlns:mc="http://schemas.openxmlformats.org/markup-compatibility/2006" xmlns:o="urn:schemas-microsoft-com:office:office" xmlns:r="http://schemas.openxmlformats.org/officeDocument/2006/relationships" xmlns:m="http://schemas.openxmlformats.org/officeDocument/2006/math" xmlns:v="urn:schemas-microsoft-com:vml" xmlns:wp14="http://schemas.microsoft.com/office/word/2010/wordprocessingDrawing" xmlns:wp="http://schemas.openxmlformats.org/drawingml/2006/wordprocessingDrawing" xmlns:w10="urn:schemas-microsoft-com:office:word" xmlns:w="http://schemas.openxmlformats.org/wordprocessingml/2006/main" xmlns:w14="http://schemas.microsoft.com/office/word/2010/wordml" xmlns:w15="http://schemas.microsoft.com/office/word/2012/wordml" xmlns:w16se="http://schemas.microsoft.com/office/word/2015/wordml/symex" xmlns:wpg="http://schemas.microsoft.com/office/word/2010/wordprocessingGroup" xmlns:wpi="http://schemas.microsoft.com/office/word/2010/wordprocessingInk" xmlns:wne="http://schemas.microsoft.com/office/word/2006/wordml" xmlns:wps="http://schemas.microsoft.com/office/word/2010/wordprocessingShape" mc:Ignorable="w14 w15 w16se wp14">
   <w:abstractNum w:abstractNumId="0" w15:restartNumberingAfterBreak="0">
     <w:nsid w:val="693D0718"/>
     <w:multiLevelType w:val="hybridMultilevel"/>
@@ -2374,14 +2482,14 @@
       </w:rPr>
     </w:lvl>
   </w:abstractNum>
-  <w:num w:numId="1" w16cid:durableId="544487646">
+  <w:num w:numId="1">
     <w:abstractNumId w:val="0"/>
   </w:num>
 </w:numbering>
 </file>
 
 <file path=word/styles.xml><?xml version="1.0" encoding="utf-8"?>
-<w:styles xmlns:mc="http://schemas.openxmlformats.org/markup-compatibility/2006" xmlns:r="http://schemas.openxmlformats.org/officeDocument/2006/relationships" xmlns:w="http://schemas.openxmlformats.org/wordprocessingml/2006/main" xmlns:w14="http://schemas.microsoft.com/office/word/2010/wordml" xmlns:w15="http://schemas.microsoft.com/office/word/2012/wordml" xmlns:w16cex="http://schemas.microsoft.com/office/word/2018/wordml/cex" xmlns:w16cid="http://schemas.microsoft.com/office/word/2016/wordml/cid" xmlns:w16="http://schemas.microsoft.com/office/word/2018/wordml" xmlns:w16du="http://schemas.microsoft.com/office/word/2023/wordml/word16du" xmlns:w16sdtdh="http://schemas.microsoft.com/office/word/2020/wordml/sdtdatahash" xmlns:w16sdtfl="http://schemas.microsoft.com/office/word/2024/wordml/sdtformatlock" xmlns:w16se="http://schemas.microsoft.com/office/word/2015/wordml/symex" mc:Ignorable="w14 w15 w16se w16cid w16 w16cex w16sdtdh w16sdtfl w16du">
+<w:styles xmlns:mc="http://schemas.openxmlformats.org/markup-compatibility/2006" xmlns:r="http://schemas.openxmlformats.org/officeDocument/2006/relationships" xmlns:w="http://schemas.openxmlformats.org/wordprocessingml/2006/main" xmlns:w14="http://schemas.microsoft.com/office/word/2010/wordml" xmlns:w15="http://schemas.microsoft.com/office/word/2012/wordml" xmlns:w16se="http://schemas.microsoft.com/office/word/2015/wordml/symex" mc:Ignorable="w14 w15 w16se">
   <w:docDefaults>
     <w:rPrDefault>
       <w:rPr>
@@ -2399,7 +2507,7 @@
       </w:pPr>
     </w:pPrDefault>
   </w:docDefaults>
-  <w:latentStyles w:defLockedState="0" w:defUIPriority="99" w:defSemiHidden="0" w:defUnhideWhenUsed="0" w:defQFormat="0" w:count="376">
+  <w:latentStyles w:defLockedState="0" w:defUIPriority="99" w:defSemiHidden="0" w:defUnhideWhenUsed="0" w:defQFormat="0" w:count="371">
     <w:lsdException w:name="Normal" w:uiPriority="0" w:qFormat="1"/>
     <w:lsdException w:name="heading 1" w:uiPriority="9" w:qFormat="1"/>
     <w:lsdException w:name="heading 2" w:semiHidden="1" w:uiPriority="9" w:unhideWhenUsed="1" w:qFormat="1"/>
@@ -2771,11 +2879,6 @@
     <w:lsdException w:name="List Table 5 Dark Accent 6" w:uiPriority="50"/>
     <w:lsdException w:name="List Table 6 Colorful Accent 6" w:uiPriority="51"/>
     <w:lsdException w:name="List Table 7 Colorful Accent 6" w:uiPriority="52"/>
-    <w:lsdException w:name="Mention" w:semiHidden="1" w:unhideWhenUsed="1"/>
-    <w:lsdException w:name="Smart Hyperlink" w:semiHidden="1" w:unhideWhenUsed="1"/>
-    <w:lsdException w:name="Hashtag" w:semiHidden="1" w:unhideWhenUsed="1"/>
-    <w:lsdException w:name="Unresolved Mention" w:semiHidden="1" w:unhideWhenUsed="1"/>
-    <w:lsdException w:name="Smart Link" w:semiHidden="1" w:unhideWhenUsed="1"/>
   </w:latentStyles>
   <w:style w:type="paragraph" w:default="1" w:styleId="Normal">
     <w:name w:val="Normal"/>
@@ -2871,6 +2974,22 @@
     <w:pPr>
       <w:spacing w:line="225" w:lineRule="exact"/>
     </w:pPr>
+  </w:style>
+  <w:style w:type="table" w:styleId="TableGrid">
+    <w:name w:val="Table Grid"/>
+    <w:basedOn w:val="TableNormal"/>
+    <w:uiPriority w:val="39"/>
+    <w:rsid w:val="007437AC"/>
+    <w:tblPr>
+      <w:tblBorders>
+        <w:top w:val="single" w:sz="4" w:space="0" w:color="auto"/>
+        <w:left w:val="single" w:sz="4" w:space="0" w:color="auto"/>
+        <w:bottom w:val="single" w:sz="4" w:space="0" w:color="auto"/>
+        <w:right w:val="single" w:sz="4" w:space="0" w:color="auto"/>
+        <w:insideH w:val="single" w:sz="4" w:space="0" w:color="auto"/>
+        <w:insideV w:val="single" w:sz="4" w:space="0" w:color="auto"/>
+      </w:tblBorders>
+    </w:tblPr>
   </w:style>
 </w:styles>
 </file>

</xml_diff>